<commit_message>
Replace OpenClaw runtime with native ATLAS broker
</commit_message>
<xml_diff>
--- a/docs/atlas-teorico-codex.docx
+++ b/docs/atlas-teorico-codex.docx
@@ -558,12 +558,7 @@
           <w:szCs w:val="26"/>
           <w:rtl w:val="0"/>
         </w:rPr>
-        <w:t xml:space="preserve">OpenClaw como base informática del proyecto</w:t>
-      </w:r>
-      <w:r>
-        <w:rPr>
-          <w:rtl w:val="0"/>
-        </w:rPr>
+        <w:t>Primer prototipo con OpenClaw</w:t>
       </w:r>
     </w:p>
     <w:p>
@@ -584,12 +579,7 @@
           <w:szCs w:val="26"/>
           <w:rtl w:val="0"/>
         </w:rPr>
-        <w:t xml:space="preserve">Funcionamiento de OpenClaw</w:t>
-      </w:r>
-      <w:r>
-        <w:rPr>
-          <w:rtl w:val="0"/>
-        </w:rPr>
+        <w:t>Qué aportó OpenClaw y por qué se descartó</w:t>
       </w:r>
     </w:p>
     <w:p>
@@ -610,12 +600,7 @@
           <w:szCs w:val="26"/>
           <w:rtl w:val="0"/>
         </w:rPr>
-        <w:t xml:space="preserve">Adaptación de OpenClaw a ATLAS</w:t>
-      </w:r>
-      <w:r>
-        <w:rPr>
-          <w:rtl w:val="0"/>
-        </w:rPr>
+        <w:t>Migración del contexto a ATLAS nativo</w:t>
       </w:r>
     </w:p>
     <w:p>
@@ -708,12 +693,7 @@
           <w:szCs w:val="26"/>
           <w:rtl w:val="0"/>
         </w:rPr>
-        <w:t xml:space="preserve">Gateway, sesiones y canales de comunicación</w:t>
-      </w:r>
-      <w:r>
-        <w:rPr>
-          <w:rtl w:val="0"/>
-        </w:rPr>
+        <w:t>Native Broker, sesiones y canales de comunicación</w:t>
       </w:r>
     </w:p>
     <w:p>
@@ -735,12 +715,7 @@
           <w:szCs w:val="26"/>
           <w:rtl w:val="0"/>
         </w:rPr>
-        <w:t xml:space="preserve">Contexto, memoria y archivos del workspace</w:t>
-      </w:r>
-      <w:r>
-        <w:rPr>
-          <w:rtl w:val="0"/>
-        </w:rPr>
+        <w:t>Contexto, memoria y archivos de .atlas</w:t>
       </w:r>
     </w:p>
     <w:p>
@@ -2362,7 +2337,7 @@
           <w:szCs w:val="30"/>
           <w:rtl w:val="0"/>
         </w:rPr>
-        <w:t xml:space="preserve">Para esta base decidí utilizar OpenClaw, una herramienta creada por el ingeniero y desarrollador de software austriaco Peter Steinberger. </w:t>
+        <w:t>Para construir el primer prototipo decidí utilizar OpenClaw, una herramienta creada por el ingeniero y desarrollador de software austriaco Peter Steinberger.</w:t>
       </w:r>
     </w:p>
     <w:p>
@@ -2379,7 +2354,7 @@
           <w:szCs w:val="30"/>
           <w:rtl w:val="0"/>
         </w:rPr>
-        <w:t xml:space="preserve">OpenClaw permite crear agentes de IA, y trabajar con modelos de lenguaje, memoria, herramientas y diferentes canales de comunicación, por lo que encajaba bastante bien con la idea de crear un agente más avanzado que un asistente digital convencional.</w:t>
+        <w:t>OpenClaw permitía conectar modelos, memoria, herramientas y canales con bastante rapidez, por lo que fue una buena forma de demostrar la idea inicial. Más adelante lo retiré del producto porque su cadena de procesos añadía demasiada latencia para una conversación por voz.</w:t>
       </w:r>
     </w:p>
     <w:p>
@@ -2777,7 +2752,7 @@
           <w:szCs w:val="30"/>
           <w:rtl w:val="0"/>
         </w:rPr>
-        <w:t xml:space="preserve">Y dado que el proyecto estaba en gran parte potenciado por el proyecto de Steinberger, OpenClaw, consideré oportuno darle el nombre de “OpenAtlas” al proyecto en sí, aunque ya he adoptado el nombre de atlas directamente. </w:t>
+        <w:t>Durante esa primera etapa, como el proyecto estaba potenciado en gran parte por OpenClaw, consideré llamar “OpenAtlas” al conjunto. El nombre terminó quedándose simplemente en ATLAS cuando el sistema empezó a tener una arquitectura y una identidad propias.</w:t>
       </w:r>
     </w:p>
     <w:p>
@@ -2861,7 +2836,7 @@
           <w:szCs w:val="30"/>
           <w:rtl w:val="0"/>
         </w:rPr>
-        <w:t xml:space="preserve">Una vez preparado ya el requisito principal para el proyecto, OpenClaw, ya podía comenzar a pensar a nivel técnico como desarrollaría el proyecto. De ahí, comencé con un planteamiento sencillo y general:</w:t>
+        <w:t>Una vez preparado el primer prototipo con OpenClaw, ya podía comenzar a pensar cómo convertir la idea en un dispositivo real. De ahí surgió este planteamiento general:</w:t>
       </w:r>
     </w:p>
     <w:p>
@@ -2895,7 +2870,7 @@
           <w:szCs w:val="30"/>
           <w:rtl w:val="0"/>
         </w:rPr>
-        <w:t xml:space="preserve">OpenClaw será la base del agente, una herramienta que permite conectar de forma sencilla los modelos, con los canales de comunicación, con los MCPs. </w:t>
+        <w:t>La primera versión utilizaría OpenClaw para unir modelos, contexto y herramientas. El diseño actual sustituye esa base por servicios propios de ATLAS, Realtime directo y un broker local.</w:t>
       </w:r>
     </w:p>
     <w:p>
@@ -3074,7 +3049,7 @@
           <w:szCs w:val="50"/>
           <w:rtl w:val="0"/>
         </w:rPr>
-        <w:t xml:space="preserve">2. OpenClaw como base principal del proyecto</w:t>
+        <w:t>2. Primer prototipo con OpenClaw y migración a ATLAS nativo</w:t>
       </w:r>
     </w:p>
     <w:p>
@@ -3108,7 +3083,7 @@
           <w:szCs w:val="30"/>
           <w:rtl w:val="0"/>
         </w:rPr>
-        <w:t xml:space="preserve">Para desarrollar ATLAS era necesario partir de una base informática capaz de conectar modelos de lenguaje, memoria, herramientas y canales de comunicación. Por este motivo, una de las primeras decisiones del proyecto fue utilizar OpenClaw como núcleo del agente.</w:t>
+        <w:t>Para desarrollar ATLAS era necesario conectar modelos de lenguaje, memoria, herramientas y canales. OpenClaw fue la primera base que utilicé para validar ese conjunto antes de construir un runtime propio más rápido y ajustado al dispositivo.</w:t>
       </w:r>
     </w:p>
     <w:p>
@@ -3139,7 +3114,7 @@
           <w:szCs w:val="30"/>
           <w:rtl w:val="0"/>
         </w:rPr>
-        <w:t xml:space="preserve">En este apartado voy a explicar detenidamente qué es OpenClaw y cada una de sus funciones que he utilizado para crear ATLAS. </w:t>
+        <w:t>En este apartado explico qué aportó OpenClaw al prototipo, qué problemas aparecieron y qué partes conservé al migrar ATLAS a su arquitectura actual.</w:t>
       </w:r>
     </w:p>
     <w:p>
@@ -3191,7 +3166,7 @@
           <w:szCs w:val="44"/>
           <w:rtl w:val="0"/>
         </w:rPr>
-        <w:t xml:space="preserve">2.1 Funcionamiento de OpenClaw</w:t>
+        <w:t>2.1 Funcionamiento del primer prototipo con OpenClaw</w:t>
       </w:r>
     </w:p>
     <w:p>
@@ -3225,7 +3200,7 @@
           <w:szCs w:val="30"/>
           <w:rtl w:val="0"/>
         </w:rPr>
-        <w:t xml:space="preserve">Para poder entender cómo funciona ATLAS, hay que entender como funciona OpenClaw por dentro. </w:t>
+        <w:t>Para entender la evolución de ATLAS conviene explicar primero cómo funcionaba aquel prototipo y qué responsabilidades resolvía OpenClaw.</w:t>
       </w:r>
     </w:p>
     <w:p>
@@ -3315,7 +3290,7 @@
           <w:szCs w:val="30"/>
           <w:rtl w:val="0"/>
         </w:rPr>
-        <w:t xml:space="preserve">Funciona de la siguiente manera. Tras instalarlo, te permite configurar por primera vez tu agente. Escoges el modelo de IA que quieres usar, los canales de comunicación que prefieras, diferentes API Keys para poder acceder a recursos en la nube y navegador para búsquedas, entre muchas otras cosas. </w:t>
+        <w:t>En aquella primera versión el flujo era bastante directo. Tras instalar OpenClaw configuré el modelo, los canales y las claves de los servicios externos. Esto me permitió tener un agente funcional muy rápido, aunque también hizo que varias responsabilidades quedasen agrupadas dentro de una herramienta que no había diseñado yo.</w:t>
       </w:r>
     </w:p>
     <w:p>
@@ -3346,7 +3321,7 @@
           <w:szCs w:val="30"/>
           <w:rtl w:val="0"/>
         </w:rPr>
-        <w:t xml:space="preserve">Una vez completada la configuración, puedes hablar con tu agente mediante uno de los canales de comunicación, o la página web creada en el localhost. </w:t>
+        <w:t>Después podía hablar con el agente desde los canales configurados o desde una página local. Para un prototipo era muy cómodo: me permitió comprobar la idea antes de construir WebScreen, atlas-chat y el resto de la arquitectura propia.</w:t>
       </w:r>
     </w:p>
     <w:p>
@@ -3377,7 +3352,7 @@
           <w:szCs w:val="30"/>
           <w:rtl w:val="0"/>
         </w:rPr>
-        <w:t xml:space="preserve">Así de simple. </w:t>
+        <w:t>Como punto de partida funcionó bien, pero todavía no era el ATLAS independiente que quería construir.</w:t>
       </w:r>
     </w:p>
     <w:p>
@@ -3408,7 +3383,7 @@
           <w:szCs w:val="30"/>
           <w:rtl w:val="0"/>
         </w:rPr>
-        <w:t xml:space="preserve">Pero para poder entender realmente qué es ATLAS, no nos podemos conformar con entender únicamente la superficie. Hay que indagar en mayor medida dentro de los archivos y el funcionamiento interno de OpenClaw. </w:t>
+        <w:t>Para entender aquella etapa no basta con mirar la página de conversación. También hay que revisar cómo OpenClaw distribuía la configuración, la memoria y las instrucciones del agente.</w:t>
       </w:r>
     </w:p>
     <w:p>
@@ -3439,25 +3414,7 @@
           <w:szCs w:val="30"/>
           <w:rtl w:val="0"/>
         </w:rPr>
-        <w:t xml:space="preserve">Tras finalizar la configuración, dentro de la carpeta del usuario, se crea la subcarpeta “.</w:t>
-      </w:r>
-      <w:r>
-        <w:rPr>
-          <w:i w:val="1"/>
-          <w:iCs w:val="1"/>
-          <w:sz w:val="30"/>
-          <w:szCs w:val="30"/>
-          <w:rtl w:val="0"/>
-        </w:rPr>
-        <w:t xml:space="preserve">openclaw</w:t>
-      </w:r>
-      <w:r>
-        <w:rPr>
-          <w:sz w:val="30"/>
-          <w:szCs w:val="30"/>
-          <w:rtl w:val="0"/>
-        </w:rPr>
-        <w:t xml:space="preserve">”. Dentro de esta, convive todo el ecosistema del agente creado. Cualquier configuración, memoria a recordar, o proyecto creado, vive dentro de esta subcarpeta. Lo que lo hace muy versátil a nivel de portabilidad. </w:t>
+        <w:t>Al terminar la configuración se creaba la carpeta .openclaw dentro del directorio del usuario. En el prototipo, allí convivían la configuración, las credenciales, las sesiones y el workspace del agente. Esta estructura resultaba cómoda para comenzar, pero terminó mezclando datos de ATLAS con el runtime de una dependencia externa.</w:t>
       </w:r>
     </w:p>
     <w:p>
@@ -3488,25 +3445,7 @@
           <w:szCs w:val="30"/>
           <w:rtl w:val="0"/>
         </w:rPr>
-        <w:t xml:space="preserve">Dentro de esta carpeta, encontramos el archivo principal y más importante “</w:t>
-      </w:r>
-      <w:r>
-        <w:rPr>
-          <w:i w:val="1"/>
-          <w:iCs w:val="1"/>
-          <w:sz w:val="30"/>
-          <w:szCs w:val="30"/>
-          <w:rtl w:val="0"/>
-        </w:rPr>
-        <w:t xml:space="preserve">openclaw.json</w:t>
-      </w:r>
-      <w:r>
-        <w:rPr>
-          <w:sz w:val="30"/>
-          <w:szCs w:val="30"/>
-          <w:rtl w:val="0"/>
-        </w:rPr>
-        <w:t xml:space="preserve">”. Dentro de este se encuentra toda la configuración principal del agente creado, en formato json, como el modelo de IA seleccionado, skills instaladas, canales de comunicación configurados, etc. </w:t>
+        <w:t>El archivo openclaw.json reunía la configuración principal en formato JSON: proveedor, modelo, canales y extensiones. Sus valores privados se migraron después a un archivo propio de ATLAS, con permisos restringidos y fuera del repositorio.</w:t>
       </w:r>
     </w:p>
     <w:p>
@@ -3523,25 +3462,7 @@
           <w:szCs w:val="30"/>
           <w:rtl w:val="0"/>
         </w:rPr>
-        <w:t xml:space="preserve">Luego, encontramos la carpeta “</w:t>
-      </w:r>
-      <w:r>
-        <w:rPr>
-          <w:i w:val="1"/>
-          <w:iCs w:val="1"/>
-          <w:sz w:val="30"/>
-          <w:szCs w:val="30"/>
-          <w:rtl w:val="0"/>
-        </w:rPr>
-        <w:t xml:space="preserve">workspace</w:t>
-      </w:r>
-      <w:r>
-        <w:rPr>
-          <w:sz w:val="30"/>
-          <w:szCs w:val="30"/>
-          <w:rtl w:val="0"/>
-        </w:rPr>
-        <w:t xml:space="preserve">”, que es donde el agente creado puede trabajar y almacenar la información que considere relevante. </w:t>
+        <w:t>La carpeta workspace almacenaba las instrucciones y los archivos de conocimiento del agente. Ese contenido sí pertenecía a ATLAS, por lo que se conservó y se verificó archivo por archivo.</w:t>
       </w:r>
     </w:p>
     <w:p>
@@ -3572,7 +3493,7 @@
           <w:szCs w:val="30"/>
           <w:rtl w:val="0"/>
         </w:rPr>
-        <w:t xml:space="preserve">Y lo más importante, dentro de dicha carpeta es donde se encuentran varios de los archivos más importantes para definir la personalidad del agente. </w:t>
+        <w:t>Dentro del workspace de aquella etapa estaban los Markdown que daban identidad y contexto al agente. Estos archivos sí eran parte de ATLAS y, por eso, fueron una de las piezas que conservé durante la migración.</w:t>
       </w:r>
     </w:p>
     <w:p>
@@ -3851,7 +3772,7 @@
           <w:szCs w:val="30"/>
           <w:rtl w:val="0"/>
         </w:rPr>
-        <w:t xml:space="preserve">Y el archivo principal y más importante: “</w:t>
+        <w:t xml:space="preserve">El archivo principal de aquel conjunto era </w:t>
       </w:r>
       <w:hyperlink r:id="rId13">
         <w:r>
@@ -3873,7 +3794,7 @@
           <w:szCs w:val="30"/>
           <w:rtl w:val="0"/>
         </w:rPr>
-        <w:t xml:space="preserve">”. Este define todo el funcionamiento del agente. </w:t>
+        <w:t>, porque enlazaba y explicaba el resto del contexto.</w:t>
       </w:r>
     </w:p>
     <w:p>
@@ -3884,25 +3805,30 @@
           <w:szCs w:val="30"/>
         </w:rPr>
       </w:pPr>
-      <w:hyperlink r:id="rId14">
-        <w:r>
-          <w:rPr>
-            <w:color w:val="1155cc"/>
-            <w:sz w:val="30"/>
-            <w:szCs w:val="30"/>
-            <w:u w:val="single"/>
-            <w:rtl w:val="0"/>
-          </w:rPr>
-          <w:t xml:space="preserve">AGENTS.md</w:t>
-        </w:r>
-      </w:hyperlink>
-      <w:r>
-        <w:rPr>
-          <w:sz w:val="30"/>
-          <w:szCs w:val="30"/>
-          <w:rtl w:val="0"/>
-        </w:rPr>
-        <w:t xml:space="preserve"> es leído por el agente siempre al inicio de una sesión, y es el archivo principal para dotar de contexto al agente. Es, por decirlo así, el archivo padre. Dentro de este, se explica cual debe ser su funcionamiento, y se referencian todos los otros archivos </w:t>
+      <w:r>
+        <w:rPr>
+          <w:sz w:val="30"/>
+          <w:szCs w:val="30"/>
+          <w:rtl w:val="0"/>
+        </w:rPr>
+        <w:t>OpenClaw lo cargaba al iniciar una sesión. Más adelante mantuve esa misma relación entre documentos, pero pasé a resolverla desde el manifest propio de .atlas/context/knowledge.</w:t>
+      </w:r>
+    </w:p>
+    <w:p>
+      <w:pPr>
+        <w:spacing w:after="240" w:before="240" w:lineRule="auto"/>
+        <w:rPr>
+          <w:sz w:val="30"/>
+          <w:szCs w:val="30"/>
+        </w:rPr>
+      </w:pPr>
+      <w:r>
+        <w:rPr>
+          <w:sz w:val="30"/>
+          <w:szCs w:val="30"/>
+          <w:rtl w:val="0"/>
+        </w:rPr>
+        <w:t xml:space="preserve">Todos estos archivos están escritos en formato markdown (</w:t>
       </w:r>
       <w:r>
         <w:rPr>
@@ -3912,32 +3838,15 @@
           <w:szCs w:val="30"/>
           <w:rtl w:val="0"/>
         </w:rPr>
-        <w:t xml:space="preserve">.md</w:t>
-      </w:r>
-      <w:r>
-        <w:rPr>
-          <w:sz w:val="30"/>
-          <w:szCs w:val="30"/>
-          <w:rtl w:val="0"/>
-        </w:rPr>
-        <w:t xml:space="preserve"> y para que sirven. </w:t>
-      </w:r>
-    </w:p>
-    <w:p>
-      <w:pPr>
-        <w:spacing w:after="240" w:before="240" w:lineRule="auto"/>
-        <w:rPr>
-          <w:sz w:val="30"/>
-          <w:szCs w:val="30"/>
-        </w:rPr>
-      </w:pPr>
-      <w:r>
-        <w:rPr>
-          <w:sz w:val="30"/>
-          <w:szCs w:val="30"/>
-          <w:rtl w:val="0"/>
-        </w:rPr>
-        <w:t xml:space="preserve">Todos estos archivos están escritos en formato markdown (</w:t>
+        <w:t xml:space="preserve">md</w:t>
+      </w:r>
+      <w:r>
+        <w:rPr>
+          <w:sz w:val="30"/>
+          <w:szCs w:val="30"/>
+          <w:rtl w:val="0"/>
+        </w:rPr>
+        <w:t xml:space="preserve">), y se utilizan para poder formatear y aplicar estilos a los textos. No obstante, podría utilizar perfectamente el formato de texto clásico (</w:t>
       </w:r>
       <w:r>
         <w:rPr>
@@ -3947,24 +3856,6 @@
           <w:szCs w:val="30"/>
           <w:rtl w:val="0"/>
         </w:rPr>
-        <w:t xml:space="preserve">md</w:t>
-      </w:r>
-      <w:r>
-        <w:rPr>
-          <w:sz w:val="30"/>
-          <w:szCs w:val="30"/>
-          <w:rtl w:val="0"/>
-        </w:rPr>
-        <w:t xml:space="preserve">), y se utilizan para poder formatear y aplicar estilos a los textos. No obstante, podría utilizar perfectamente el formato de texto clásico (</w:t>
-      </w:r>
-      <w:r>
-        <w:rPr>
-          <w:i w:val="1"/>
-          <w:iCs w:val="1"/>
-          <w:sz w:val="30"/>
-          <w:szCs w:val="30"/>
-          <w:rtl w:val="0"/>
-        </w:rPr>
         <w:t xml:space="preserve">txt</w:t>
       </w:r>
       <w:r>
@@ -4004,7 +3895,7 @@
           <w:szCs w:val="30"/>
           <w:rtl w:val="0"/>
         </w:rPr>
-        <w:t xml:space="preserve">Todos estos archivos, son los que permiten al agente (ATLAS, en mi caso), contextualizar su entorno y situarse. </w:t>
+        <w:t>En resumen, los Markdown eran lo que hacía que un agente genérico entendiese su entorno y se convirtiese en ATLAS. OpenClaw fue el primer contenedor; el conocimiento era del proyecto.</w:t>
       </w:r>
     </w:p>
     <w:p>
@@ -4071,7 +3962,7 @@
           <w:szCs w:val="44"/>
           <w:rtl w:val="0"/>
         </w:rPr>
-        <w:t xml:space="preserve">2.2 Adaptación de OpenClaw a ATLAS</w:t>
+        <w:t>2.2 Adaptación del contexto y migración a .atlas</w:t>
       </w:r>
     </w:p>
     <w:p>
@@ -4106,7 +3997,7 @@
           <w:szCs w:val="30"/>
           <w:rtl w:val="0"/>
         </w:rPr>
-        <w:t xml:space="preserve">Una vez visto cómo funciona OpenClaw y cómo se distribuyen sus archivos, tocaba adaptar el agente y convertirlo en ATLAS. </w:t>
+        <w:t>La primera adaptación consistió en reescribir los archivos del workspace para convertir un agente genérico en ATLAS. La segunda, realizada más adelante, fue separar ese conocimiento de OpenClaw y trasladarlo a una estructura controlada por el propio proyecto.</w:t>
       </w:r>
     </w:p>
     <w:p>
@@ -4158,7 +4049,7 @@
           <w:szCs w:val="30"/>
           <w:rtl w:val="0"/>
         </w:rPr>
-        <w:t xml:space="preserve">Además, era importante medir bien el tono con el que lo hacía. Si miramos los archivos oficiales de contexto de OpenClaw, nos encontramos con un tono y una forma de escribir más humana que robótica. </w:t>
+        <w:t>También era importante medir bien el tono. Conservé la idea de escribir instrucciones directas y humanas, pero desde entonces su organización y su carga ya no dependen del formato interno de OpenClaw.</w:t>
       </w:r>
     </w:p>
     <w:p>
@@ -4175,7 +4066,7 @@
           <w:szCs w:val="30"/>
           <w:rtl w:val="0"/>
         </w:rPr>
-        <w:t xml:space="preserve">No trata al agente como una IA, lo trata como un humano más, y esto lo podemos comprobar con las primeras dos líneas del archivo principal:</w:t>
+        <w:t>Ese estilo no hablaba al agente como a una máquina, sino como a un colaborador. Se ve muy bien en las dos primeras líneas del archivo original:</w:t>
       </w:r>
     </w:p>
     <w:p>
@@ -4266,7 +4157,7 @@
           <w:szCs w:val="30"/>
           <w:rtl w:val="0"/>
         </w:rPr>
-        <w:t xml:space="preserve">Una vez planteado lo que tenía que hacer, me puse a ello. El archivo final que edité fue AGENTS.md, porque en este era donde se hacía referencia al resto de archivos. </w:t>
+        <w:t>El archivo principal continuó siendo AGENTS.md, porque explica las relaciones entre el resto del contexto. Actualmente vive en .atlas/context/knowledge junto con los manuales que carga WebScreen y atlas-chat.</w:t>
       </w:r>
     </w:p>
     <w:p>
@@ -4283,27 +4174,7 @@
           <w:szCs w:val="30"/>
           <w:rtl w:val="0"/>
         </w:rPr>
-        <w:t xml:space="preserve">En </w:t>
-      </w:r>
-      <w:hyperlink r:id="rId15">
-        <w:r>
-          <w:rPr>
-            <w:color w:val="1155cc"/>
-            <w:sz w:val="30"/>
-            <w:szCs w:val="30"/>
-            <w:u w:val="single"/>
-            <w:rtl w:val="0"/>
-          </w:rPr>
-          <w:t xml:space="preserve">MEMORY.md</w:t>
-        </w:r>
-      </w:hyperlink>
-      <w:r>
-        <w:rPr>
-          <w:sz w:val="30"/>
-          <w:szCs w:val="30"/>
-          <w:rtl w:val="0"/>
-        </w:rPr>
-        <w:t xml:space="preserve"> expliqué como debía gestionar la memoria y la información importante, tanto para él, como para el usuario. </w:t>
+        <w:t>MEMORY.md, USER.md y los demás documentos mantienen la memoria y las preferencias duraderas. Los turnos compartidos se guardan por separado en .atlas/context/conversation para no mezclar conocimiento estable con el historial que cambia.</w:t>
       </w:r>
     </w:p>
     <w:p>
@@ -4320,47 +4191,7 @@
           <w:szCs w:val="30"/>
           <w:rtl w:val="0"/>
         </w:rPr>
-        <w:t xml:space="preserve">En </w:t>
-      </w:r>
-      <w:hyperlink r:id="rId16">
-        <w:r>
-          <w:rPr>
-            <w:color w:val="1155cc"/>
-            <w:sz w:val="30"/>
-            <w:szCs w:val="30"/>
-            <w:u w:val="single"/>
-            <w:rtl w:val="0"/>
-          </w:rPr>
-          <w:t xml:space="preserve">SOUL.md</w:t>
-        </w:r>
-      </w:hyperlink>
-      <w:r>
-        <w:rPr>
-          <w:sz w:val="30"/>
-          <w:szCs w:val="30"/>
-          <w:rtl w:val="0"/>
-        </w:rPr>
-        <w:t xml:space="preserve"> e </w:t>
-      </w:r>
-      <w:hyperlink r:id="rId17">
-        <w:r>
-          <w:rPr>
-            <w:color w:val="1155cc"/>
-            <w:sz w:val="30"/>
-            <w:szCs w:val="30"/>
-            <w:u w:val="single"/>
-            <w:rtl w:val="0"/>
-          </w:rPr>
-          <w:t xml:space="preserve">IDENTITY.md</w:t>
-        </w:r>
-      </w:hyperlink>
-      <w:r>
-        <w:rPr>
-          <w:sz w:val="30"/>
-          <w:szCs w:val="30"/>
-          <w:rtl w:val="0"/>
-        </w:rPr>
-        <w:t xml:space="preserve"> preparé su forma de hablar y de escribir: sencilla, amigable, en minúscula cuando no pido un texto concreto o algo largo. Explicando también quién era, qué debía hacer y que era parte de mi TDR. </w:t>
+        <w:t>SOUL.md e IDENTITY.md definen quién es ATLAS y cómo se expresa: sencillo, cercano y adaptado a la situación, sin perder de vista que forma parte de mi TDR.</w:t>
       </w:r>
     </w:p>
     <w:p>
@@ -4377,47 +4208,7 @@
           <w:szCs w:val="30"/>
           <w:rtl w:val="0"/>
         </w:rPr>
-        <w:t xml:space="preserve">Y añadí dos archivos nuevos: </w:t>
-      </w:r>
-      <w:hyperlink r:id="rId18">
-        <w:r>
-          <w:rPr>
-            <w:color w:val="1155cc"/>
-            <w:sz w:val="30"/>
-            <w:szCs w:val="30"/>
-            <w:u w:val="single"/>
-            <w:rtl w:val="0"/>
-          </w:rPr>
-          <w:t xml:space="preserve">ENVIRONMENT.md</w:t>
-        </w:r>
-      </w:hyperlink>
-      <w:r>
-        <w:rPr>
-          <w:sz w:val="30"/>
-          <w:szCs w:val="30"/>
-          <w:rtl w:val="0"/>
-        </w:rPr>
-        <w:t xml:space="preserve"> y </w:t>
-      </w:r>
-      <w:hyperlink r:id="rId19">
-        <w:r>
-          <w:rPr>
-            <w:color w:val="1155cc"/>
-            <w:sz w:val="30"/>
-            <w:szCs w:val="30"/>
-            <w:u w:val="single"/>
-            <w:rtl w:val="0"/>
-          </w:rPr>
-          <w:t xml:space="preserve">TDR.md</w:t>
-        </w:r>
-      </w:hyperlink>
-      <w:r>
-        <w:rPr>
-          <w:sz w:val="30"/>
-          <w:szCs w:val="30"/>
-          <w:rtl w:val="0"/>
-        </w:rPr>
-        <w:t xml:space="preserve">. El primero era a posteriori, explicando el entorno en el que funcionaría (Raspberry Pi OS), y las limitaciones de los recursos. </w:t>
+        <w:t>ENVIRONMENT.md describe la Raspberry Pi, su hardware y sus límites. TDR.md reúne la información académica que ATLAS necesita para hablar del proyecto con precisión.</w:t>
       </w:r>
     </w:p>
     <w:p>
@@ -4428,25 +4219,30 @@
           <w:szCs w:val="30"/>
         </w:rPr>
       </w:pPr>
-      <w:hyperlink r:id="rId20">
-        <w:r>
-          <w:rPr>
-            <w:color w:val="1155cc"/>
-            <w:sz w:val="30"/>
-            <w:szCs w:val="30"/>
-            <w:u w:val="single"/>
-            <w:rtl w:val="0"/>
-          </w:rPr>
-          <w:t xml:space="preserve">TDR.md</w:t>
-        </w:r>
-      </w:hyperlink>
-      <w:r>
-        <w:rPr>
-          <w:sz w:val="30"/>
-          <w:szCs w:val="30"/>
-          <w:rtl w:val="0"/>
-        </w:rPr>
-        <w:t xml:space="preserve"> era probablemente el más importante. Dejé lista toda la explicación del TDR, qué sería, como lo haría, etc. También le cité las fechas del borrador, la entrega del TDR, y la exposición oral, para que tuviese en cuenta el tiempo restante para cada cosa. </w:t>
+      <w:r>
+        <w:rPr>
+          <w:sz w:val="30"/>
+          <w:szCs w:val="30"/>
+          <w:rtl w:val="0"/>
+        </w:rPr>
+        <w:t>TDR.md guarda las dos fechas que ATLAS debe tener presentes: la parte teórica se entrega el 21 de octubre y la presentación se hará entre el 9 y el 11 de noviembre.</w:t>
+      </w:r>
+    </w:p>
+    <w:p>
+      <w:pPr>
+        <w:spacing w:after="240" w:before="240" w:lineRule="auto"/>
+        <w:rPr>
+          <w:sz w:val="30"/>
+          <w:szCs w:val="30"/>
+        </w:rPr>
+      </w:pPr>
+      <w:r>
+        <w:rPr>
+          <w:sz w:val="30"/>
+          <w:szCs w:val="30"/>
+          <w:rtl w:val="0"/>
+        </w:rPr>
+        <w:t>Mi tutor es Rafael Roca Campos, a quien llamamos Rafa. La defensa será ante un tribunal de tres profesores: Rafa y otros dos que todavía no conozco. Prepararé una presentación en Canva y quiero que el propio ATLAS me ayude a explicar el proyecto; por eso también conoce quién es Rafa y puede dirigirse a él de forma natural cuando esté presente.</w:t>
       </w:r>
     </w:p>
     <w:p>
@@ -4627,12 +4423,7 @@
           <w:szCs w:val="30"/>
           <w:rtl w:val="0"/>
         </w:rPr>
-        <w:t xml:space="preserve">Hasta este punto he explicado cómo funciona OpenClaw y cómo adapté sus archivos para crear la personalidad de ATLAS. Sin embargo, con el desarrollo del proyecto me di cuenta de que ATLAS ya no podía describirse únicamente como un agente configurado dentro de OpenClaw. Poco a poco se había convertido en un ecosistema formado por varias capas: el modelo de inteligencia artificial, el Gateway, la memoria, las herramientas, los canales de comunicación, la interfaz de voz y, finalmente, el dispositivo físico ATLAS A1.</w:t>
-      </w:r>
-      <w:r>
-        <w:rPr>
-          <w:rtl w:val="0"/>
-        </w:rPr>
+        <w:t>Hasta este punto he explicado el origen de ATLAS y el papel que tuvo OpenClaw en el primer prototipo. El sistema actual ya es un ecosistema propio: combina gpt-realtime-2.1, Native Broker, contexto y memoria en .atlas, herramientas locales, WebScreen, Companion, la aplicación Android y el dispositivo físico ATLAS A1.</w:t>
       </w:r>
     </w:p>
     <w:p>
@@ -4775,12 +4566,7 @@
           <w:szCs w:val="44"/>
           <w:rtl w:val="0"/>
         </w:rPr>
-        <w:t xml:space="preserve">3.2 Gateway, sesiones y canales de comunicación</w:t>
-      </w:r>
-      <w:r>
-        <w:rPr>
-          <w:rtl w:val="0"/>
-        </w:rPr>
+        <w:t>3.2 Native Broker, sesiones y canales de comunicación</w:t>
       </w:r>
     </w:p>
     <w:p>
@@ -4799,31 +4585,7 @@
           <w:szCs w:val="30"/>
           <w:rtl w:val="0"/>
         </w:rPr>
-        <w:t xml:space="preserve">OpenClaw utiliza un Gateway como punto central. Este servicio permanece ejecutándose en ATLAS A1 y coordina las sesiones, los modelos, los canales y las llamadas a herramientas. En la instalación actual escucha únicamente en la interfaz local para su API interna, mientras que las interfaces que sí deben ser accesibles se publican de forma controlada. La documentación de OpenClaw describe precisamente el Gateway como el servicio que conecta canales y agentes y mantiene el estado de las sesiones.</w:t>
-      </w:r>
-      <w:r>
-        <w:rPr>
-          <w:rtl w:val="0"/>
-        </w:rPr>
-        <w:t xml:space="preserve"> </w:t>
-      </w:r>
-      <w:hyperlink r:id="rId21">
-        <w:r>
-          <w:rPr>
-            <w:rFonts w:ascii="Arial" w:cs="Arial" w:eastAsia="Arial" w:hAnsi="Arial"/>
-            <w:color w:val="1155cc"/>
-            <w:sz w:val="30"/>
-            <w:szCs w:val="30"/>
-            <w:u w:val="single"/>
-            <w:rtl w:val="0"/>
-          </w:rPr>
-          <w:t xml:space="preserve">[documentación oficial de OpenClaw]</w:t>
-        </w:r>
-      </w:hyperlink>
-      <w:r>
-        <w:rPr>
-          <w:rtl w:val="0"/>
-        </w:rPr>
+        <w:t>En la arquitectura actual ya no existe un Gateway de OpenClaw. ATLAS Native Broker mantiene un proceso codex app-server durante la vida del servicio, comprueba el estado de la cuenta, normaliza las cuotas y crea secretos efímeros para las sesiones de gpt-realtime-2.1. El OAuth persistente sigue siendo propiedad de Codex y se conserva en /home/atlas/.codex/auth.json; el broker no lo copia a .atlas, no lo devuelve por HTTP y no lo escribe en los logs.</w:t>
       </w:r>
     </w:p>
     <w:p>
@@ -4842,7 +4604,7 @@
           <w:szCs w:val="30"/>
           <w:rtl w:val="0"/>
         </w:rPr>
-        <w:t>ATLAS se puede utilizar desde la terminal, Telegram, WebScreen y la aplicación Android. atlas-chat permite probar la misma ruta Realtime de WebScreen sin micrófono ni síntesis de voz. Telegram conserva su propio canal de OpenClaw. La aplicación Android se comunica con el servicio Companion de ATLAS A1 a través de la red privada Tailscale y mantiene separadas la conversación, la administración y el control del teléfono. Compartir el ecosistema no implica que todos los canales utilicen el mismo transporte ni la misma presentación.</w:t>
+        <w:t>Para diagnosticar esta capa creé atlas-broker health, atlas-broker usage y atlas-broker session. Cada comando comprueba una parte distinta sin imprimir tokens ni identificadores: el proceso y el login, las ventanas de uso o la capacidad de crear una reserva Realtime.</w:t>
       </w:r>
     </w:p>
     <w:p>
@@ -4861,12 +4623,7 @@
           <w:szCs w:val="30"/>
           <w:rtl w:val="0"/>
         </w:rPr>
-        <w:t xml:space="preserve">Telegram funciona bien para mensajes asíncronos: el usuario escribe, puede esperar unos segundos y recibe una respuesta completa. La voz es diferente. Durante una conversación, varios segundos de silencio se sienten como un fallo aunque el resultado final sea correcto. Por eso WebScreen necesitó una arquitectura específica, optimizada no solo para el tiempo total, sino sobre todo para el tiempo hasta la primera respuesta audible.</w:t>
-      </w:r>
-      <w:r>
-        <w:rPr>
-          <w:rtl w:val="0"/>
-        </w:rPr>
+        <w:t>ATLAS se puede utilizar desde WebScreen, atlas-chat y la aplicación Android. atlas-chat prueba la misma ruta Realtime desde la terminal, mientras que Companion conecta el S23 Ultra con A1 mediante Tailscale. El antiguo canal de Telegram se eliminó junto con OpenClaw porque no formaba parte del flujo que quería para el producto.</w:t>
       </w:r>
     </w:p>
     <w:p>
@@ -4885,12 +4642,26 @@
           <w:szCs w:val="30"/>
           <w:rtl w:val="0"/>
         </w:rPr>
-        <w:t xml:space="preserve">Las sesiones son otra pieza importante. Una sesión conserva el contexto inmediato de una conversación, mientras que los archivos del workspace y la memoria permiten que información relevante sobreviva entre sesiones. Esta separación evita que todas las conversaciones se conviertan en un único bloque infinito y, al mismo tiempo, impide que ATLAS “olvide quién es” cada vez que se reinicia.</w:t>
-      </w:r>
-      <w:r>
-        <w:rPr>
-          <w:rtl w:val="0"/>
-        </w:rPr>
+        <w:t>La voz impuso una exigencia distinta a la de un chat asíncrono. El prototipo con OpenClaw daba respuestas de buena calidad, pero en las pruebas de voz acumulaba normalmente entre siete y quince segundos. En pruebas comparables, la ruta Realtime directa comenzó a hablar aproximadamente entre dos y tres segundos cuando la sesión ya estaba preparada. Son medidas del prototipo, no una promesa fija: la red, el audio y las herramientas pueden cambiar el resultado.</w:t>
+      </w:r>
+    </w:p>
+    <w:p>
+      <w:pPr>
+        <w:spacing w:after="240" w:before="240" w:line="276" w:lineRule="auto"/>
+        <w:rPr/>
+      </w:pPr>
+      <w:r>
+        <w:rPr>
+          <w:rFonts w:ascii="Arial" w:cs="Arial" w:eastAsia="Arial" w:hAnsi="Arial"/>
+          <w:b w:val="0"/>
+          <w:bCs w:val="0"/>
+          <w:i w:val="0"/>
+          <w:iCs w:val="0"/>
+          <w:sz w:val="30"/>
+          <w:szCs w:val="30"/>
+          <w:rtl w:val="0"/>
+        </w:rPr>
+        <w:t>Una sesión conserva el contexto inmediato de una conversación. La memoria compartida de los turnos se guarda en .atlas/context/conversation y el conocimiento estable permanece en .atlas/context/knowledge. Así, reiniciar una sesión de Realtime no obliga a ATLAS a olvidar su identidad ni a convertir todo el historial en un bloque infinito.</w:t>
       </w:r>
     </w:p>
     <w:p>
@@ -4911,12 +4682,7 @@
           <w:szCs w:val="44"/>
           <w:rtl w:val="0"/>
         </w:rPr>
-        <w:t xml:space="preserve">3.3 Contexto, memoria y archivos del workspace</w:t>
-      </w:r>
-      <w:r>
-        <w:rPr>
-          <w:rtl w:val="0"/>
-        </w:rPr>
+        <w:t>3.3 Contexto, memoria y archivos de .atlas</w:t>
       </w:r>
     </w:p>
     <w:p>
@@ -4935,12 +4701,7 @@
           <w:szCs w:val="30"/>
           <w:rtl w:val="0"/>
         </w:rPr>
-        <w:t xml:space="preserve">El workspace sigue siendo el lugar en el que ATLAS entiende su entorno. AGENTS.md actúa como archivo padre y explica para qué sirve cada uno de los anexos. IDENTITY.md define quién es ATLAS; SOUL.md determina su carácter y su tono; USER.md contiene información relevante del usuario; MEMORY.md resume recuerdos duraderos; ENVIRONMENT.md describe la Raspberry Pi y sus limitaciones; TDR.md mantiene el contexto del trabajo de investigación; y TOOLS.md documenta herramientas y convenciones de uso.</w:t>
-      </w:r>
-      <w:r>
-        <w:rPr>
-          <w:rtl w:val="0"/>
-        </w:rPr>
+        <w:t>La carpeta .atlas/context/knowledge es el lugar en el que ATLAS entiende su entorno. AGENTS.md actúa como archivo padre; IDENTITY.md define quién es; SOUL.md determina su carácter; USER.md contiene preferencias; MEMORY.md resume recuerdos; ENVIRONMENT.md describe A1; TDR.md mantiene el contexto académico; y TOOLS.md documenta herramientas y convenciones.</w:t>
       </w:r>
     </w:p>
     <w:p>
@@ -4983,31 +4744,7 @@
           <w:szCs w:val="30"/>
           <w:rtl w:val="0"/>
         </w:rPr>
-        <w:t xml:space="preserve">La memoria de OpenClaw se apoya en archivos Markdown del workspace. Son texto normal, legible por una persona y fácil de versionar, pero el agente puede buscarlos y utilizarlos como memoria a largo plazo. Esta decisión es especialmente útil en un TDR porque hace visible qué conoce el sistema y permite revisar o corregir sus recuerdos sin depender de una base de datos opaca.</w:t>
-      </w:r>
-      <w:r>
-        <w:rPr>
-          <w:rtl w:val="0"/>
-        </w:rPr>
-        <w:t xml:space="preserve"> </w:t>
-      </w:r>
-      <w:hyperlink r:id="rId22">
-        <w:r>
-          <w:rPr>
-            <w:rFonts w:ascii="Arial" w:cs="Arial" w:eastAsia="Arial" w:hAnsi="Arial"/>
-            <w:color w:val="1155cc"/>
-            <w:sz w:val="30"/>
-            <w:szCs w:val="30"/>
-            <w:u w:val="single"/>
-            <w:rtl w:val="0"/>
-          </w:rPr>
-          <w:t xml:space="preserve">[memoria en OpenClaw]</w:t>
-        </w:r>
-      </w:hyperlink>
-      <w:r>
-        <w:rPr>
-          <w:rtl w:val="0"/>
-        </w:rPr>
+        <w:t>La memoria nativa de ATLAS se apoya en Markdown legible y versionable. Esto resulta especialmente útil en un TDR porque permite ver qué conoce el sistema y corregirlo sin depender de una base de datos opaca. Un manifest define el orden y la prioridad de carga para WebScreen y atlas-chat.</w:t>
       </w:r>
     </w:p>
     <w:p>
@@ -5052,12 +4789,7 @@
           <w:szCs w:val="44"/>
           <w:rtl w:val="0"/>
         </w:rPr>
-        <w:t xml:space="preserve">3.4 Herramientas, plugins, MCPs y comandos atlas-*</w:t>
-      </w:r>
-      <w:r>
-        <w:rPr>
-          <w:rtl w:val="0"/>
-        </w:rPr>
+        <w:t>3.4 Herramientas, function calling y comandos atlas-*</w:t>
       </w:r>
     </w:p>
     <w:p>
@@ -5076,12 +4808,7 @@
           <w:szCs w:val="30"/>
           <w:rtl w:val="0"/>
         </w:rPr>
-        <w:t xml:space="preserve">Un modelo de lenguaje puede explicar cómo se comprueba el almacenamiento de Linux, pero para decir cuánto espacio queda realmente necesita observar el sistema. En la ruta actual, Realtime solicita atlas_shell para ejecutar comandos y atlas_web_search para buscar información. El backend realiza la operación y devuelve su resultado. OpenClaw conserva además sus herramientas, plugins y conectores para los canales que los utilizan.</w:t>
-      </w:r>
-      <w:r>
-        <w:rPr>
-          <w:rtl w:val="0"/>
-        </w:rPr>
+        <w:t>Un modelo puede explicar cómo comprobar el almacenamiento de Linux, pero para decir cuánto queda realmente necesita observar el sistema. Realtime solicita herramientas nativas como atlas_shell, atlas_web_search, atlas_routine y las operaciones de Companion; el backend ejecuta la acción y devuelve un resultado estructurado dentro del mismo turno.</w:t>
       </w:r>
     </w:p>
     <w:p>
@@ -5100,31 +4827,7 @@
           <w:szCs w:val="30"/>
           <w:rtl w:val="0"/>
         </w:rPr>
-        <w:t xml:space="preserve">La documentación de OpenClaw separa las herramientas del razonamiento del modelo: el modelo decide que necesita una acción, solicita la herramienta y recibe un resultado estructurado. Esto es más seguro y más verificable que fingir la respuesta. También introduce latencia, ya que la solicitud debe viajar, ejecutarse y regresar antes de que el agente pueda concluir.</w:t>
-      </w:r>
-      <w:r>
-        <w:rPr>
-          <w:rtl w:val="0"/>
-        </w:rPr>
-        <w:t xml:space="preserve"> </w:t>
-      </w:r>
-      <w:hyperlink r:id="rId23">
-        <w:r>
-          <w:rPr>
-            <w:rFonts w:ascii="Arial" w:cs="Arial" w:eastAsia="Arial" w:hAnsi="Arial"/>
-            <w:color w:val="1155cc"/>
-            <w:sz w:val="30"/>
-            <w:szCs w:val="30"/>
-            <w:u w:val="single"/>
-            <w:rtl w:val="0"/>
-          </w:rPr>
-          <w:t xml:space="preserve">[herramientas de OpenClaw]</w:t>
-        </w:r>
-      </w:hyperlink>
-      <w:r>
-        <w:rPr>
-          <w:rtl w:val="0"/>
-        </w:rPr>
+        <w:t>El function calling separa razonamiento y ejecución: el modelo decide que necesita una acción, solicita una función definida por ATLAS y recibe su resultado. Es más verificable que fingir la respuesta y permite limitar cada herramienta, aunque una operación externa puede seguir añadiendo latencia al turno.</w:t>
       </w:r>
     </w:p>
     <w:p>
@@ -5162,16 +4865,14 @@
           <w:szCs w:val="30"/>
           <w:rtl w:val="0"/>
         </w:rPr>
-        <w:t xml:space="preserve">También separé los archivos del agente de los archivos del dispositivo. La configuración propia de OpenClaw vive en .openclaw, mientras que WebScreen, el escritorio, la gestión de pantalla, RAFAS y sus recursos se agrupan en .atlas. Esta distribución evita que el proyecto físico se confunda con el workspace mental del agente. Puede parecer un detalle menor, pero cuando un prototipo empieza a crecer, dos carpetas bien pensadas ahorran bastante</w:t>
-      </w:r>
-      <w:r>
-        <w:rPr>
-          <w:sz w:val="30"/>
-          <w:szCs w:val="30"/>
-          <w:rtl w:val="0"/>
-        </w:rPr>
-        <w:t xml:space="preserve"> tiempo</w:t>
-      </w:r>
+        <w:t>Todo el runtime actual pertenece a .atlas. knowledge contiene instrucciones estables; conversation, el estado que cambia; roles, los perfiles declarativos; config/secrets.json, únicamente las claves permitidas con modo 0600; y las demás carpetas, WebScreen, Companion, herramientas y recursos del dispositivo. OpenClaw queda solo como antecedente histórico y ya no está instalado.</w:t>
+      </w:r>
+    </w:p>
+    <w:p>
+      <w:pPr>
+        <w:spacing w:after="240" w:before="240" w:line="276" w:lineRule="auto"/>
+        <w:rPr/>
+      </w:pPr>
       <w:r>
         <w:rPr>
           <w:rFonts w:ascii="Arial" w:cs="Arial" w:eastAsia="Arial" w:hAnsi="Arial"/>
@@ -5183,20 +4884,26 @@
           <w:szCs w:val="30"/>
           <w:rtl w:val="0"/>
         </w:rPr>
-        <w:t xml:space="preserve"> de </w:t>
-      </w:r>
-      <w:r>
-        <w:rPr>
-          <w:sz w:val="30"/>
-          <w:szCs w:val="30"/>
-          <w:rtl w:val="0"/>
-        </w:rPr>
-        <w:t xml:space="preserve">buscar dónde estaba cada cosa</w:t>
-      </w:r>
-      <w:r>
-        <w:rPr>
-          <w:rtl w:val="0"/>
-        </w:rPr>
+        <w:t>También he separado el contexto por roles. atlas-full describe el ATLAS completo y equivale al comportamiento actual. profesores es una demostración de mínima autoridad: carga únicamente IDENTITY.md y PROFESORES.md, recibe la fecha y la hora actuales y no puede usar shell, red, escritura, memoria mutable ni herramientas del dispositivo.</w:t>
+      </w:r>
+    </w:p>
+    <w:p>
+      <w:pPr>
+        <w:spacing w:after="240" w:before="240" w:line="276" w:lineRule="auto"/>
+        <w:rPr/>
+      </w:pPr>
+      <w:r>
+        <w:rPr>
+          <w:rFonts w:ascii="Arial" w:cs="Arial" w:eastAsia="Arial" w:hAnsi="Arial"/>
+          <w:b w:val="0"/>
+          <w:bCs w:val="0"/>
+          <w:i w:val="0"/>
+          <w:iCs w:val="0"/>
+          <w:sz w:val="30"/>
+          <w:szCs w:val="30"/>
+          <w:rtl w:val="0"/>
+        </w:rPr>
+        <w:t>Los manifiestos ya están versionados, pero todavía no existe un selector dinámico ni un sistema de composición activo. El horario de diecinueve profesores es ficticio y sirve como demostración; por tanto, esta parte prueba cómo limitar contexto y capacidades, no representa todavía un despliegue real del instituto.</w:t>
       </w:r>
     </w:p>
     <w:p>
@@ -5778,7 +5485,7 @@
           <w:i w:val="0"/>
           <w:sz w:val="30"/>
         </w:rPr>
-        <w:t>La carpeta .openclaw contiene la configuración del Gateway, credenciales, sesiones, plugins y el workspace. La carpeta .atlas reúne las piezas específicas del dispositivo, entre ellas WebScreen, atlas-chat, el servicio Companion 0.2.1, la aplicación y su conexión Tailscale, los modos gráficos, RAFAS y sus backups. Los proyectos creados desde WebScreen se almacenan en un workspace separado para no llenar de pruebas la carpeta principal del agente.</w:t>
+        <w:t>La carpeta .atlas reúne el runtime completo: contexto, conversación, roles, Native Broker, WebScreen, atlas-chat, Companion 0.2.1, rutinas, gestión de pantalla, RAFAS, herramientas y backups. Las claves de Tavily y ElevenLabs se guardan en .atlas/config/secrets.json con permisos 0600; el OAuth de Codex se conserva por separado en .codex/auth.json. Ninguna de estas credenciales se publica en GitHub.</w:t>
       </w:r>
     </w:p>
     <w:p>
@@ -5797,12 +5504,7 @@
           <w:szCs w:val="30"/>
           <w:rtl w:val="0"/>
         </w:rPr>
-        <w:t xml:space="preserve">Los servicios se gestionan con systemd. Esto permite iniciar componentes al arrancar, reiniciarlos si fallan y consultar su estado sin depender de que haya una sesión SSH abierta. El Gateway, WebScreen, los modos gráficos y RAFAS tienen necesidades distintas, por lo que no conviene empaquetarlos como un único proceso gigantesco. Si una interfaz falla, el resto del sistema debería seguir siendo recuperable.</w:t>
-      </w:r>
-      <w:r>
-        <w:rPr>
-          <w:rtl w:val="0"/>
-        </w:rPr>
+        <w:t>Los servicios se gestionan con systemd. WebScreen, Companion, los modos de pantalla, RAFAS y las conexiones de audio tienen ciclos distintos, por lo que no conviene convertirlos en un único proceso. Native Broker inicia codex app-server bajo demanda y lo mantiene para evitar pagar el arranque en cada sesión.</w:t>
       </w:r>
     </w:p>
     <w:p>
@@ -6342,12 +6044,7 @@
           <w:szCs w:val="30"/>
           <w:rtl w:val="0"/>
         </w:rPr>
-        <w:t xml:space="preserve">El siguiente cambio fue sustituir la transcripción de WebScreen por la Web Speech API disponible en Chrome. Durante las pruebas, la transcripción parcial aparecía prácticamente en tiempo real y reconocía mejor el español hablado que el modelo Whisper pequeño utilizado en la Raspberry Pi. Se mantuvo Whisper en OpenClaw para otros usos, pero WebScreen dejó de depender de él en cada turno.</w:t>
-      </w:r>
-      <w:r>
-        <w:rPr>
-          <w:rtl w:val="0"/>
-        </w:rPr>
+        <w:t>El siguiente cambio fue utilizar la Web Speech API de Chrome como detector local y apoyo para la entrada del WebScreen. Whisper.cpp se conserva de forma independiente en .atlas/tools como transcriptor auxiliar y herramienta de diagnóstico; sus binarios y su modelo ya no dependen de otra aplicación ni participan obligatoriamente en cada turno.</w:t>
       </w:r>
     </w:p>
     <w:p>
@@ -8087,9 +7784,7 @@
     <w:p>
       <w:pPr>
         <w:spacing w:after="240" w:before="240" w:line="276" w:lineRule="auto"/>
-        <w:rPr>
-          <w:color w:val="ff0000"/>
-        </w:rPr>
+        <w:rPr/>
       </w:pPr>
       <w:r>
         <w:rPr>
@@ -8102,26 +7797,7 @@
           <w:szCs w:val="30"/>
           <w:rtl w:val="0"/>
         </w:rPr>
-        <w:t xml:space="preserve">La sesión puede mantener contexto durante la conversación y </w:t>
-      </w:r>
-      <w:r>
-        <w:rPr>
-          <w:rFonts w:ascii="Arial" w:cs="Arial" w:eastAsia="Arial" w:hAnsi="Arial"/>
-          <w:b w:val="0"/>
-          <w:bCs w:val="0"/>
-          <w:i w:val="0"/>
-          <w:iCs w:val="0"/>
-          <w:color w:val="ff0000"/>
-          <w:sz w:val="30"/>
-          <w:szCs w:val="30"/>
-          <w:rtl w:val="0"/>
-        </w:rPr>
-        <w:t xml:space="preserve">admite varias voces nativas. La interfaz incluye un selector con alloy, ash, ballad, cedar, coral, echo, marin, sage, shimmer y verse. Una limitación relevante es que la voz no puede cambiarse una vez que la sesión ya ha emitido audio; para aplicar el cambio se crea una sesión nueva.</w:t>
-      </w:r>
-      <w:r>
-        <w:rPr>
-          <w:rtl w:val="0"/>
-        </w:rPr>
+        <w:t>Realtime admite voces nativas como alloy, ash, ballad, beacon, cedar, coral, echo, marin, sage, shimmer y verse, entre otras. Una limitación relevante es que la voz no puede cambiarse una vez que la sesión ya ha emitido audio; para aplicar el cambio se crea una sesión nueva.</w:t>
       </w:r>
     </w:p>
     <w:p>
@@ -8219,12 +7895,7 @@
           <w:szCs w:val="30"/>
           <w:rtl w:val="0"/>
         </w:rPr>
-        <w:t xml:space="preserve">La herramienta atlas_shell ejecuta comandos en A1 y devuelve la salida real; atlas_web_search ofrece búsqueda web; y atlas_routine administra automatizaciones deterministas. Realtime decide cuándo usar estas herramientas y continúa a partir del resultado. OpenClaw interviene en la reserva autenticada de la sesión, pero ninguno de sus agentes procesa por ello la conversación.</w:t>
-      </w:r>
-      <w:r>
-        <w:rPr>
-          <w:rtl w:val="0"/>
-        </w:rPr>
+        <w:t>La herramienta atlas_shell ejecuta comandos en A1; atlas_web_search busca mediante Tavily; y atlas_routine administra automatizaciones deterministas. Native Broker prepara la reserva WebRTC con el OAuth de Codex y entrega a WebScreen o atlas-chat una sesión efímera. No hay un segundo agente ni una delegación intermedia procesando la conversación.</w:t>
       </w:r>
     </w:p>
     <w:p>
@@ -8647,7 +8318,7 @@
           <w:szCs w:val="30"/>
           <w:rtl w:val="0"/>
         </w:rPr>
-        <w:t>El rework distingue conexión con la Pi, transporte Realtime y Gateway. WebScreen comprueba el control cada 1,5 segundos y tolera ocho de interrupción; el servidor conserva la reserva veinte segundos. Los errores de autorización siguen una recuperación distinta. La tolerancia no mantiene disponible una Pi sin red.</w:t>
+        <w:t>El rework distingue la conexión con la Pi, el control del cliente y el transporte Realtime. WebScreen comprueba el control cada 1,5 segundos, tolera interrupciones breves y conserva una reserva temporal en el servidor. Un microcorte no debe derribar de inmediato una sesión que aún puede recuperarse.</w:t>
       </w:r>
     </w:p>
     <w:p>
@@ -8685,7 +8356,7 @@
           <w:szCs w:val="30"/>
           <w:rtl w:val="0"/>
         </w:rPr>
-        <w:t>El puente comprueba y recupera el Gateway en segundo plano: un ECONNREFUSED no termina el proceso. Lee el cuerpo HTTP antes de reutilizar conexiones. Un fallo 500 o de transcripción no demuestra por sí solo que OAuth esté dañado.</w:t>
+        <w:t>Native Broker mantiene codex app-server como proceso persistente y reinicia únicamente esa capa si deja de responder. Los fallos de red, autorización, transcripción y proveedor se registran por separado. Un HTTP 500 no demuestra por sí solo que el OAuth esté dañado.</w:t>
       </w:r>
     </w:p>
     <w:p>
@@ -9033,12 +8704,7 @@
                 <w:szCs w:val="19"/>
                 <w:rtl w:val="0"/>
               </w:rPr>
-              <w:t xml:space="preserve">Ejecuta ATLAS OS, OpenClaw, WebScreen y los servicios del dispositivo.</w:t>
-            </w:r>
-            <w:r>
-              <w:rPr>
-                <w:rtl w:val="0"/>
-              </w:rPr>
+              <w:t>Ejecuta ATLAS OS, Native Broker, WebScreen, Companion y los servicios del dispositivo.</w:t>
             </w:r>
           </w:p>
         </w:tc>
@@ -10347,12 +10013,7 @@
           <w:szCs w:val="30"/>
           <w:rtl w:val="0"/>
         </w:rPr>
-        <w:t xml:space="preserve">RAFAS significa Recovery Access For ATLAS Systems. Surgió porque ATLAS podía solucionar muchos errores por sí mismo, pero no podía hacerlo si fallaban simultáneamente el Gateway, el proveedor del modelo o la conexión de red. En esas situaciones el agente entraba, metafóricamente, en hibernación. Y si además no había red, ni siquiera podía conectarme por SSH para repararlo.</w:t>
-      </w:r>
-      <w:r>
-        <w:rPr>
-          <w:rtl w:val="0"/>
-        </w:rPr>
+        <w:t>RAFAS significa Recovery Access For ATLAS Systems. Surgió porque un agente conectado a la nube no puede repararse si fallan a la vez el proveedor, la red o su interfaz principal. En esas situaciones ATLAS entra, metafóricamente, en hibernación y necesito una vía física de recuperación.</w:t>
       </w:r>
     </w:p>
     <w:p>
@@ -10371,12 +10032,7 @@
           <w:szCs w:val="30"/>
           <w:rtl w:val="0"/>
         </w:rPr>
-        <w:t xml:space="preserve">RAFAS ofrece una vía de recuperación local independiente de Chrome, WebScreen y OpenClaw. Al conectar un teclado y pulsar Control + W + O + W, un servicio mínimo enciende la pantalla si es necesario y cambia a una terminal de recuperación en tty8. También se puede forzar mediante atlas-screen --rafas.</w:t>
-      </w:r>
-      <w:r>
-        <w:rPr>
-          <w:rtl w:val="0"/>
-        </w:rPr>
+        <w:t>RAFAS ofrece una vía local independiente de Chrome, WebScreen, Native Broker y cualquier modelo en la nube. Al conectar un teclado y pulsar Control + W + O + W, un servicio mínimo enciende la pantalla si es necesario y cambia a una terminal de recuperación en tty8. También se puede forzar mediante atlas-screen --rafas.</w:t>
       </w:r>
     </w:p>
     <w:p>
@@ -14690,12 +14346,7 @@
           <w:szCs w:val="30"/>
           <w:rtl w:val="0"/>
         </w:rPr>
-        <w:t xml:space="preserve">Las credenciales de proveedores, Telegram y conectores se almacenan fuera del repositorio público. Cuando se crea una imagen distribuible, la limpieza se realiza sobre la copia y no sobre la Raspberry Pi de desarrollo. Así se evita romper el prototipo mientras se garantiza que la versión publicada no contiene redes Wi-Fi, tokens, historiales ni datos personales.</w:t>
-      </w:r>
-      <w:r>
-        <w:rPr>
-          <w:rtl w:val="0"/>
-        </w:rPr>
+        <w:t>Las claves de Tavily y ElevenLabs se guardan en /home/atlas/.atlas/config/secrets.json, con permisos 0600 y fuera de Git. El OAuth de Codex permanece separado en /home/atlas/.codex/auth.json, y las credenciales de emparejamiento se conservan en el estado privado de Companion. Ninguno de estos datos se imprime en los logs ni se incluye en una imagen distribuible.</w:t>
       </w:r>
     </w:p>
     <w:p>
@@ -14752,12 +14403,7 @@
           <w:szCs w:val="30"/>
           <w:rtl w:val="0"/>
         </w:rPr>
-        <w:t xml:space="preserve">La fiabilidad se apoya en varios niveles: systemd supervisa servicios, atlas-status resume el dispositivo, atlas-rafas ofrece diagnóstico y recuperación local, y atlas-chat permite comprobar el modelo y sus herramientas sin depender del audio. Los logs y backups completan el diagnóstico. Un Gateway caído, una ruta de audio ausente o una respuesta 500 del proveedor deben registrarse por separado; renovar OAuth sin comprobar la causa puede no resolver ninguno de ellos.</w:t>
-      </w:r>
-      <w:r>
-        <w:rPr>
-          <w:rtl w:val="0"/>
-        </w:rPr>
+        <w:t>La fiabilidad se apoya en systemd, atlas-status, atlas-rafas, atlas-chat y los logs. Native Broker permite comprobar por separado OAuth, cuotas, codex app-server y la reserva de Realtime. Una ruta de audio ausente, una Pi sin red o un error 500 del proveedor exigen diagnósticos distintos; volver a autenticar sin comprobar la causa puede no resolver ninguno.</w:t>
       </w:r>
     </w:p>
     <w:p>
@@ -14936,12 +14582,7 @@
           <w:szCs w:val="30"/>
           <w:rtl w:val="0"/>
         </w:rPr>
-        <w:t xml:space="preserve">OpenClaw ocupa otra categoría. No es un asistente doméstico terminado ni un modelo; es una plataforma de agentes autoalojada. Permite conectar proveedores, canales, memoria y herramientas dentro de un Gateway. Esta flexibilidad fue la razón de escogerlo como base, pero también implica que la experiencia final debe diseñarse. WebScreen, ATLAS OS y ATLAS A1 son precisamente esa capa de producto que OpenClaw no pretende imponer.</w:t>
-      </w:r>
-      <w:r>
-        <w:rPr>
-          <w:rtl w:val="0"/>
-        </w:rPr>
+        <w:t>OpenClaw ocupa otra categoría: es una plataforma de agentes autoalojada, no un asistente doméstico terminado. Su flexibilidad permitió construir rápidamente el primer prototipo, pero su Gateway y la delegación acumulaban normalmente entre siete y quince segundos. Por eso lo sustituí por Native Broker, contexto propio y Realtime directo, que encajan mejor con una conversación física.</w:t>
       </w:r>
     </w:p>
     <w:p>
@@ -15658,12 +15299,7 @@
                 <w:szCs w:val="19"/>
                 <w:rtl w:val="0"/>
               </w:rPr>
-              <w:t xml:space="preserve">Agente OpenClaw</w:t>
-            </w:r>
-            <w:r>
-              <w:rPr>
-                <w:rtl w:val="0"/>
-              </w:rPr>
+              <w:t>Primer prototipo con OpenClaw</w:t>
             </w:r>
           </w:p>
         </w:tc>
@@ -15694,12 +15330,7 @@
                 <w:szCs w:val="19"/>
                 <w:rtl w:val="0"/>
               </w:rPr>
-              <w:t xml:space="preserve">Memoria, canales y herramientas</w:t>
-            </w:r>
-            <w:r>
-              <w:rPr>
-                <w:rtl w:val="0"/>
-              </w:rPr>
+              <w:t>Permitió unir rápidamente modelo, memoria, canales y herramientas.</w:t>
             </w:r>
           </w:p>
         </w:tc>
@@ -15730,12 +15361,7 @@
                 <w:szCs w:val="19"/>
                 <w:rtl w:val="0"/>
               </w:rPr>
-              <w:t xml:space="preserve">No incluye una interfaz física específica</w:t>
-            </w:r>
-            <w:r>
-              <w:rPr>
-                <w:rtl w:val="0"/>
-              </w:rPr>
+              <w:t>En las pruebas de voz acumulaba normalmente entre 7 y 15 s y dependía de un Gateway externo a ATLAS.</w:t>
             </w:r>
           </w:p>
         </w:tc>
@@ -15766,12 +15392,7 @@
                 <w:szCs w:val="19"/>
                 <w:rtl w:val="0"/>
               </w:rPr>
-              <w:t xml:space="preserve">Contexto, canales y reserva autenticada de la sesión Realtime.</w:t>
-            </w:r>
-            <w:r>
-              <w:rPr>
-                <w:rtl w:val="0"/>
-              </w:rPr>
+              <w:t>Antecedente histórico que validó la idea; no forma parte del runtime actual.</w:t>
             </w:r>
           </w:p>
         </w:tc>
@@ -16185,12 +15806,7 @@
           <w:szCs w:val="30"/>
           <w:rtl w:val="0"/>
         </w:rPr>
-        <w:t xml:space="preserve">Crear un índice de contexto para consultar AGENTS.md y sus anexos sin cargarlos completos en cada sesión.</w:t>
-      </w:r>
-      <w:r>
-        <w:rPr>
-          <w:rtl w:val="0"/>
-        </w:rPr>
+        <w:t>Evaluar una recuperación selectiva sobre el manifest de contexto existente, para reducir el tiempo de preparación sin perder instrucciones ni relaciones importantes entre los documentos.</w:t>
       </w:r>
     </w:p>
     <w:p>
@@ -16423,6 +16039,10 @@
         <w:pStyle w:val="Normal"/>
         <w:spacing w:after="240" w:before="240" w:line="276" w:lineRule="auto"/>
         <w:rPr/>
+        <w:numPr>
+          <w:ilvl w:val="0"/>
+          <w:numId w:val="2"/>
+        </w:numPr>
       </w:pPr>
       <w:r>
         <w:rPr>
@@ -16439,6 +16059,10 @@
         <w:pStyle w:val="Normal"/>
         <w:spacing w:after="240" w:before="240" w:line="276" w:lineRule="auto"/>
         <w:rPr/>
+        <w:numPr>
+          <w:ilvl w:val="0"/>
+          <w:numId w:val="2"/>
+        </w:numPr>
       </w:pPr>
       <w:r>
         <w:rPr>
@@ -16454,6 +16078,10 @@
       <w:pPr>
         <w:spacing w:after="240" w:before="240" w:line="276" w:lineRule="auto"/>
         <w:rPr/>
+        <w:numPr>
+          <w:ilvl w:val="0"/>
+          <w:numId w:val="2"/>
+        </w:numPr>
       </w:pPr>
       <w:r>
         <w:rPr>
@@ -16485,12 +16113,7 @@
           <w:szCs w:val="30"/>
           <w:rtl w:val="0"/>
         </w:rPr>
-        <w:t xml:space="preserve">Una posibilidad especialmente interesante es que ATLAS deje de tener un único agente de trabajo. Realtime podría actuar como coordinador y desplegar agentes especializados según la tarea: desarrollo, búsqueda, administración o análisis. Cada agente tendría permisos y contexto distintos. El usuario seguiría hablando con una sola identidad, pero por debajo funcionaría un equipo.</w:t>
-      </w:r>
-      <w:r>
-        <w:rPr>
-          <w:rtl w:val="0"/>
-        </w:rPr>
+        <w:t>Implementar un selector de roles que valide cada manifest y aplique sus capacidades antes de iniciar la sesión, sin conceder permisos por el simple hecho de cargar un Markdown.</w:t>
       </w:r>
     </w:p>
     <w:p>
@@ -16509,12 +16132,7 @@
           <w:szCs w:val="30"/>
           <w:rtl w:val="0"/>
         </w:rPr>
-        <w:t xml:space="preserve">El reto será que esa ampliación no convierta el sistema en una colección incontrolable de procesos. Cada nuevo agente deberá aportar una mejora medible, registrar su actividad y poder cancelarse. La arquitectura futura debe sentirse más capaz desde fuera y seguir siendo comprensible por dentro.</w:t>
-      </w:r>
-      <w:r>
-        <w:rPr>
-          <w:rtl w:val="0"/>
-        </w:rPr>
+        <w:t>Probar la composición explícita entre atlas-full y profesores, manteniendo profesores como perfil cerrado cuando se use solo y dejando claro en la interfaz qué contexto y qué herramientas están activos.</w:t>
       </w:r>
     </w:p>
     <w:p>
@@ -17319,12 +16937,7 @@
           <w:szCs w:val="30"/>
           <w:rtl w:val="0"/>
         </w:rPr>
-        <w:t xml:space="preserve">OpenClaw 2026.7.1-2 como Gateway, sistema de agentes, memoria, canales, plugins y herramientas.</w:t>
-      </w:r>
-      <w:r>
-        <w:rPr>
-          <w:rtl w:val="0"/>
-        </w:rPr>
+        <w:t>OpenClaw 2026.7.1-2 en el primer prototipo de agente; retirado después de migrar el contexto, las credenciales necesarias y el flujo Realtime a componentes propios de ATLAS.</w:t>
       </w:r>
     </w:p>
     <w:p>
@@ -17494,12 +17107,7 @@
           <w:szCs w:val="30"/>
           <w:rtl w:val="0"/>
         </w:rPr>
-        <w:t xml:space="preserve">Python para el backend de WebScreen y utilidades del sistema.</w:t>
-      </w:r>
-      <w:r>
-        <w:rPr>
-          <w:rtl w:val="0"/>
-        </w:rPr>
+        <w:t>Python para Native Broker, el backend de WebScreen, el motor de rutinas y la mayor parte de las herramientas del runtime.</w:t>
       </w:r>
     </w:p>
     <w:p>
@@ -17519,12 +17127,7 @@
           <w:szCs w:val="30"/>
           <w:rtl w:val="0"/>
         </w:rPr>
-        <w:t xml:space="preserve">Node.js para el puente persistente con OpenClaw y componentes del Gateway.</w:t>
-      </w:r>
-      <w:r>
-        <w:rPr>
-          <w:rtl w:val="0"/>
-        </w:rPr>
+        <w:t>Node.js para pruebas de WebScreen, supervisión del navegador y componentes auxiliares de desarrollo; ya no existe un puente persistente con OpenClaw en el producto actual.</w:t>
       </w:r>
     </w:p>
     <w:p>
@@ -17864,12 +17467,7 @@
           <w:szCs w:val="30"/>
           <w:rtl w:val="0"/>
         </w:rPr>
-        <w:t xml:space="preserve">El hecho de que la lista sea larga no significa que ATLAS sea una simple suma de programas. El trabajo del proyecto está en integrarlos, decidir qué responsabilidad tiene cada uno y construir una experiencia coherente encima. Muchas herramientas podrían sustituirse; la arquitectura y las decisiones que las conectan son lo que define el sistema.</w:t>
-      </w:r>
-      <w:r>
-        <w:rPr>
-          <w:rtl w:val="0"/>
-        </w:rPr>
+        <w:t>La lista no convierte ATLAS en una simple suma de programas. El proyecto consiste en integrarlos, asignar responsabilidades y construir una experiencia coherente. Muchas herramientas podrían sustituirse; lo que define el sistema es la arquitectura que las conecta.</w:t>
       </w:r>
     </w:p>
     <w:sectPr>

</xml_diff>